<commit_message>
Add pizza sales dataset and visuals
This commit adds the cleaned pizza sales dataset under a normalized filename, includes generated KPI visuals and Excel dashboard assets, and updates the project report artifacts. It also removes placeholder README files from the data and visuals folders, and includes the resulting binary deliverables for the analysis.
</commit_message>
<xml_diff>
--- a/reports/Pizza KPIs.docx
+++ b/reports/Pizza KPIs.docx
@@ -1321,246 +1321,6 @@
             </a:graphic>
           </wp:inline>
         </w:drawing>
-      </w:r>
-    </w:p>
-    <w:p/>
-    <w:p>
-      <w:r>
-        <w:rPr>
-          <w:b/>
-          <w:bCs/>
-          <w:i/>
-          <w:iCs/>
-          <w:u w:val="single"/>
-        </w:rPr>
-        <w:t>NOTE</w:t>
-      </w:r>
-    </w:p>
-    <w:p>
-      <w:r>
-        <w:t>If you want to apply the Month, Quarter, Week filters to the above queries you can use WHERE clause. Follow some of below examples</w:t>
-      </w:r>
-    </w:p>
-    <w:p>
-      <w:r>
-        <w:t xml:space="preserve">SELECT DATENAME(DW, </w:t>
-      </w:r>
-      <w:proofErr w:type="spellStart"/>
-      <w:r>
-        <w:t>order_date</w:t>
-      </w:r>
-      <w:proofErr w:type="spellEnd"/>
-      <w:r>
-        <w:t xml:space="preserve">) AS </w:t>
-      </w:r>
-      <w:proofErr w:type="spellStart"/>
-      <w:r>
-        <w:t>order_day</w:t>
-      </w:r>
-      <w:proofErr w:type="spellEnd"/>
-      <w:r>
-        <w:t xml:space="preserve">, COUNT(DISTINCT </w:t>
-      </w:r>
-      <w:proofErr w:type="spellStart"/>
-      <w:r>
-        <w:t>order_id</w:t>
-      </w:r>
-      <w:proofErr w:type="spellEnd"/>
-      <w:r>
-        <w:t xml:space="preserve">) AS </w:t>
-      </w:r>
-      <w:proofErr w:type="spellStart"/>
-      <w:r>
-        <w:t>total_orders</w:t>
-      </w:r>
-      <w:proofErr w:type="spellEnd"/>
-      <w:r>
-        <w:t> </w:t>
-      </w:r>
-    </w:p>
-    <w:p>
-      <w:r>
-        <w:t>FROM pizza_sales</w:t>
-      </w:r>
-    </w:p>
-    <w:p>
-      <w:r>
-        <w:t>WHERE MONTH(</w:t>
-      </w:r>
-      <w:proofErr w:type="spellStart"/>
-      <w:r>
-        <w:t>order_date</w:t>
-      </w:r>
-      <w:proofErr w:type="spellEnd"/>
-      <w:r>
-        <w:t>) = 1</w:t>
-      </w:r>
-    </w:p>
-    <w:p>
-      <w:r>
-        <w:t xml:space="preserve">GROUP BY DATENAME(DW, </w:t>
-      </w:r>
-      <w:proofErr w:type="spellStart"/>
-      <w:r>
-        <w:t>order_date</w:t>
-      </w:r>
-      <w:proofErr w:type="spellEnd"/>
-      <w:r>
-        <w:t>)</w:t>
-      </w:r>
-    </w:p>
-    <w:p/>
-    <w:p>
-      <w:r>
-        <w:rPr>
-          <w:i/>
-          <w:iCs/>
-        </w:rPr>
-        <w:lastRenderedPageBreak/>
-        <w:t>*Here MONTH(</w:t>
-      </w:r>
-      <w:proofErr w:type="spellStart"/>
-      <w:r>
-        <w:rPr>
-          <w:i/>
-          <w:iCs/>
-        </w:rPr>
-        <w:t>order_date</w:t>
-      </w:r>
-      <w:proofErr w:type="spellEnd"/>
-      <w:r>
-        <w:rPr>
-          <w:i/>
-          <w:iCs/>
-        </w:rPr>
-        <w:t>) = 1 indicates that the output is for the month of January. MONTH(</w:t>
-      </w:r>
-      <w:proofErr w:type="spellStart"/>
-      <w:r>
-        <w:rPr>
-          <w:i/>
-          <w:iCs/>
-        </w:rPr>
-        <w:t>order_date</w:t>
-      </w:r>
-      <w:proofErr w:type="spellEnd"/>
-      <w:r>
-        <w:rPr>
-          <w:i/>
-          <w:iCs/>
-        </w:rPr>
-        <w:t>) = 4 indicates output for Month of April.</w:t>
-      </w:r>
-    </w:p>
-    <w:p/>
-    <w:p>
-      <w:r>
-        <w:t xml:space="preserve">SELECT DATENAME(DW, </w:t>
-      </w:r>
-      <w:proofErr w:type="spellStart"/>
-      <w:r>
-        <w:t>order_date</w:t>
-      </w:r>
-      <w:proofErr w:type="spellEnd"/>
-      <w:r>
-        <w:t xml:space="preserve">) AS </w:t>
-      </w:r>
-      <w:proofErr w:type="spellStart"/>
-      <w:r>
-        <w:t>order_day</w:t>
-      </w:r>
-      <w:proofErr w:type="spellEnd"/>
-      <w:r>
-        <w:t xml:space="preserve">, COUNT(DISTINCT </w:t>
-      </w:r>
-      <w:proofErr w:type="spellStart"/>
-      <w:r>
-        <w:t>order_id</w:t>
-      </w:r>
-      <w:proofErr w:type="spellEnd"/>
-      <w:r>
-        <w:t xml:space="preserve">) AS </w:t>
-      </w:r>
-      <w:proofErr w:type="spellStart"/>
-      <w:r>
-        <w:t>total_orders</w:t>
-      </w:r>
-      <w:proofErr w:type="spellEnd"/>
-      <w:r>
-        <w:t> </w:t>
-      </w:r>
-    </w:p>
-    <w:p>
-      <w:r>
-        <w:t>FROM pizza_sales</w:t>
-      </w:r>
-    </w:p>
-    <w:p>
-      <w:r>
-        <w:t xml:space="preserve">WHERE DATEPART(QUARTER, </w:t>
-      </w:r>
-      <w:proofErr w:type="spellStart"/>
-      <w:r>
-        <w:t>order_date</w:t>
-      </w:r>
-      <w:proofErr w:type="spellEnd"/>
-      <w:r>
-        <w:t>) = 1</w:t>
-      </w:r>
-    </w:p>
-    <w:p>
-      <w:r>
-        <w:t xml:space="preserve">GROUP BY DATENAME(DW, </w:t>
-      </w:r>
-      <w:proofErr w:type="spellStart"/>
-      <w:r>
-        <w:t>order_date</w:t>
-      </w:r>
-      <w:proofErr w:type="spellEnd"/>
-      <w:r>
-        <w:t>)</w:t>
-      </w:r>
-    </w:p>
-    <w:p/>
-    <w:p>
-      <w:r>
-        <w:rPr>
-          <w:i/>
-          <w:iCs/>
-        </w:rPr>
-        <w:t xml:space="preserve">*Here DATEPART(QUARTER, </w:t>
-      </w:r>
-      <w:proofErr w:type="spellStart"/>
-      <w:r>
-        <w:rPr>
-          <w:i/>
-          <w:iCs/>
-        </w:rPr>
-        <w:t>order_date</w:t>
-      </w:r>
-      <w:proofErr w:type="spellEnd"/>
-      <w:r>
-        <w:rPr>
-          <w:i/>
-          <w:iCs/>
-        </w:rPr>
-        <w:t>) = 1 indicates that the output is for the Quarter 1. MONTH(</w:t>
-      </w:r>
-      <w:proofErr w:type="spellStart"/>
-      <w:r>
-        <w:rPr>
-          <w:i/>
-          <w:iCs/>
-        </w:rPr>
-        <w:t>order_date</w:t>
-      </w:r>
-      <w:proofErr w:type="spellEnd"/>
-      <w:r>
-        <w:rPr>
-          <w:i/>
-          <w:iCs/>
-        </w:rPr>
-        <w:t>) = 3 indicates output for Quarter 3.</w:t>
       </w:r>
     </w:p>
     <w:p>

</xml_diff>